<commit_message>
Match the spot test captions to what the figures actually show
Two mismatches between the captions and the figures they describe:

The Figure 2 caption marked the resistant isolates with a florette (U+273F)
where the figure's own legend uses a heavy asterisk (U+2731), so the symbol
in the caption did not appear anywhere on the figure.

The Figure 1 caption announced panels (A) and (B), but only the colony-count
panel carries a printed label; the photograph panel has none. Describes them
as left and right panels instead, which is what a reader sees.

Co-Authored-By: Claude Opus 5 <noreply@anthropic.com>
</commit_message>
<xml_diff>
--- a/documents/2026-10-21_spot_test_figures/2026-10-21_spot_test_figure_captions.docx
+++ b/documents/2026-10-21_spot_test_figures/2026-10-21_spot_test_figure_captions.docx
@@ -379,15 +379,15 @@
           <w:sz w:val="22"/>
           <w:szCs w:val="22"/>
         </w:rPr>
-        <w:t xml:space="preserve">(A) Each 7 µL drop, cropped from the plate photograph without colour correction; rows are strains, columns treatments. </w:t>
-      </w:r>
-      <w:r>
-        <w:rPr>
-          <w:rFonts w:ascii="Arial" w:cs="Arial" w:eastAsia="Arial" w:hAnsi="Arial"/>
-          <w:sz w:val="22"/>
-          <w:szCs w:val="22"/>
-        </w:rPr>
-        <w:t xml:space="preserve">(B) Colonies counted inside each drop; one point per strain, bars show medians. </w:t>
+        <w:t xml:space="preserve">Left panel: each 7 µL drop, cropped from the plate photograph without colour correction; rows are strains, columns treatments. </w:t>
+      </w:r>
+      <w:r>
+        <w:rPr>
+          <w:rFonts w:ascii="Arial" w:cs="Arial" w:eastAsia="Arial" w:hAnsi="Arial"/>
+          <w:sz w:val="22"/>
+          <w:szCs w:val="22"/>
+        </w:rPr>
+        <w:t xml:space="preserve">Right panel (B): colonies counted inside each drop; one point per strain, bars show medians. </w:t>
       </w:r>
       <w:r>
         <w:rPr>
@@ -577,7 +577,7 @@
           <w:sz w:val="22"/>
           <w:szCs w:val="22"/>
         </w:rPr>
-        <w:t xml:space="preserve">✿ marks the two Φ8-resistant isolates picked from the sensitive parents. </w:t>
+        <w:t xml:space="preserve">✱ marks the two Φ8-resistant isolates picked from the sensitive parents. </w:t>
       </w:r>
       <w:r>
         <w:rPr>

</xml_diff>